<commit_message>
Facilitator script: match Schoolwide Decision wording
</commit_message>
<xml_diff>
--- a/resources/systems/procedures/staff-learning/culture-systems-facilitator-script.docx
+++ b/resources/systems/procedures/staff-learning/culture-systems-facilitator-script.docx
@@ -2023,7 +2023,7 @@
                       <w:szCs w:val="19"/>
                       <w:rtl w:val="0"/>
                     </w:rPr>
-                    <w:t xml:space="preserve">“A few calls in these documents are marked with this pencil icon — ‘Called for Now.’ That means it's a real decision, but it's not permanent. If it doesn't hold up in practice, we revise it and move on.”</w:t>
+                    <w:t>“A few calls in these documents are marked Schoolwide Decision. That is the answer every adult teaches and holds.”</w:t>
                   </w:r>
                   <w:r>
                     <w:rPr>
@@ -5783,7 +5783,7 @@
                       <w:szCs w:val="19"/>
                       <w:rtl w:val="0"/>
                     </w:rPr>
-                    <w:t xml:space="preserve">2 MIN  —  </w:t>
+                    <w:t>2 MIN  —  Using the Script</w:t>
                   </w:r>
                   <w:r>
                     <w:rPr>
@@ -5795,7 +5795,6 @@
                       <w:szCs w:val="19"/>
                       <w:rtl w:val="0"/>
                     </w:rPr>
-                    <w:t xml:space="preserve">Using the Sample Script</w:t>
                   </w:r>
                   <w:r>
                     <w:rPr>
@@ -5881,7 +5880,7 @@
                       <w:szCs w:val="19"/>
                       <w:rtl w:val="0"/>
                     </w:rPr>
-                    <w:t xml:space="preserve">“You can use the sample script almost word for word if it already sounds like you — or use it only as a model and write your own. Either way, once you pick your cue or your routine, it holds all year.”</w:t>
+                    <w:t>“The script is ready to use as written. Once you pick your cue or your routine, it holds all year.”</w:t>
                   </w:r>
                   <w:r>
                     <w:rPr>

</xml_diff>